<commit_message>
Updating response to reviewers
</commit_message>
<xml_diff>
--- a/Cressler_et_al_reviewer_response.docx
+++ b/Cressler_et_al_reviewer_response.docx
@@ -8,38 +8,14 @@
       </w:r>
       <w:r>
         <w:br/>
-        <w:t xml:space="preserve">This manuscript explores how virulence evolves in immunologically heterogeneous host populations. The authors build on a previously published within-host model of interactions between parasites and two immune responses (analogous to the </w:t>
-      </w:r>
-      <w:proofErr w:type="gramStart"/>
-      <w:r>
-        <w:t>mutually-inhibitory</w:t>
-      </w:r>
-      <w:proofErr w:type="gramEnd"/>
-      <w:r>
-        <w:t xml:space="preserve"> Th1 and Th2 responses of the adaptive immune system), by embedding it in an epidemiological model and running stochastic individual based simulations. Individuals differ in their initial immune state — drawn from uniform distributions that are either Th1 or Th2 biased — and initial dose, dependent on the within-host dynamics of the transmitting individual.</w:t>
-      </w:r>
-      <w:r>
-        <w:br/>
-      </w:r>
-      <w:r>
-        <w:br/>
-        <w:t xml:space="preserve">The authors first show that these two sources of stochasticity can fundamentally alter the outcome of infections at the individual level, leading to acute or chronic infections, and then demonstrate that this scales up to effect epidemiological and evolutionary outcomes. A </w:t>
-      </w:r>
-      <w:proofErr w:type="gramStart"/>
-      <w:r>
-        <w:t>Th1 bias leads</w:t>
-      </w:r>
-      <w:proofErr w:type="gramEnd"/>
-      <w:r>
-        <w:t xml:space="preserve"> to chronic infections, high infection prevalence in the host population, and evolution of low virulence, while a Th2 bias leads to acute infections, low infection prevalence (and more frequent epidemic fade </w:t>
-      </w:r>
-      <w:proofErr w:type="gramStart"/>
-      <w:r>
-        <w:t>outs</w:t>
-      </w:r>
-      <w:proofErr w:type="gramEnd"/>
-      <w:r>
-        <w:t>) and the evolution of lower virulence. The authors break down these evolutionary effects in terms of different parasite fitness components: in the Th1-biased case, longer infection durations and lower recovery probabilities pay off while in the Th2-biased case, higher peak biomass and higher transmission rates pay off. Finally, the authors use adaptive dynamics with a simplified model to show that evolutionary dynamics of virulence in response to changing the probability of recovery — and not its rate — are consistent with patterns observed in their multi-scale stochastic model.</w:t>
+        <w:t>This manuscript explores how virulence evolves in immunologically heterogeneous host populations. The authors build on a previously published within-host model of interactions between parasites and two immune responses (analogous to the mutually-inhibitory Th1 and Th2 responses of the adaptive immune system), by embedding it in an epidemiological model and running stochastic individual based simulations. Individuals differ in their initial immune state — drawn from uniform distributions that are either Th1 or Th2 biased — and initial dose, dependent on the within-host dynamics of the transmitting individual.</w:t>
+      </w:r>
+      <w:r>
+        <w:br/>
+      </w:r>
+      <w:r>
+        <w:br/>
+        <w:t>The authors first show that these two sources of stochasticity can fundamentally alter the outcome of infections at the individual level, leading to acute or chronic infections, and then demonstrate that this scales up to effect epidemiological and evolutionary outcomes. A Th1 bias leads to chronic infections, high infection prevalence in the host population, and evolution of low virulence, while a Th2 bias leads to acute infections, low infection prevalence (and more frequent epidemic fade outs) and the evolution of lower virulence. The authors break down these evolutionary effects in terms of different parasite fitness components: in the Th1-biased case, longer infection durations and lower recovery probabilities pay off while in the Th2-biased case, higher peak biomass and higher transmission rates pay off. Finally, the authors use adaptive dynamics with a simplified model to show that evolutionary dynamics of virulence in response to changing the probability of recovery — and not its rate — are consistent with patterns observed in their multi-scale stochastic model.</w:t>
       </w:r>
       <w:r>
         <w:br/>
@@ -64,113 +40,33 @@
           <w:i/>
           <w:iCs/>
         </w:rPr>
-        <w:t xml:space="preserve">We sincerely thank the </w:t>
-      </w:r>
-      <w:proofErr w:type="gramStart"/>
+        <w:t>We sincerely thank the reviewer for their enthusiasm for our work! We are really gratified to hear that they found it as interesting as we did!</w:t>
+      </w:r>
+    </w:p>
+    <w:p>
+      <w:r>
+        <w:br/>
+        <w:t>Main comments.</w:t>
+      </w:r>
+      <w:r>
+        <w:br/>
+      </w:r>
+      <w:r>
+        <w:br/>
+        <w:t xml:space="preserve">1. I’m curious about the language used to describe what is being maximized by the parasites in the different cases (e.g., l. 108-111, l. 409-412). Presumably the evolved strategies in each case are maximising the total number of new infections generated on average by each infection, yeah? And in the Th1-biased case they do this by maximising </w:t>
+      </w:r>
+      <w:r>
+        <w:lastRenderedPageBreak/>
+        <w:t>infection duration (to take advantage of a long-term opportunities for transmission) while in the Th2-biased case they do this by maximising the probability of transmission given a contact? So, “maximising transmission” in only one of those cases doesn’t sound quite right to me.</w:t>
+      </w:r>
+    </w:p>
+    <w:p>
       <w:r>
         <w:rPr>
           <w:i/>
           <w:iCs/>
         </w:rPr>
-        <w:t>reviewer</w:t>
-      </w:r>
-      <w:proofErr w:type="gramEnd"/>
-      <w:r>
-        <w:rPr>
-          <w:i/>
-          <w:iCs/>
-        </w:rPr>
-        <w:t xml:space="preserve"> for their enthusiasm for our work! We are really gratified to hear that they found it as interesting as we did!</w:t>
-      </w:r>
-    </w:p>
-    <w:p>
-      <w:r>
-        <w:br/>
-        <w:t>Main comments.</w:t>
-      </w:r>
-      <w:r>
-        <w:br/>
-      </w:r>
-      <w:r>
-        <w:br/>
-        <w:t xml:space="preserve">1. I’m curious about the language used to describe what is being maximized by </w:t>
-      </w:r>
-      <w:proofErr w:type="gramStart"/>
-      <w:r>
-        <w:t>the parasites</w:t>
-      </w:r>
-      <w:proofErr w:type="gramEnd"/>
-      <w:r>
-        <w:t xml:space="preserve"> in the different cases (e.g., l. 108-111, l. 409-412). Presumably the evolved strategies in each case are </w:t>
-      </w:r>
-      <w:proofErr w:type="spellStart"/>
-      <w:r>
-        <w:t>maximising</w:t>
-      </w:r>
-      <w:proofErr w:type="spellEnd"/>
-      <w:r>
-        <w:t xml:space="preserve"> the total number of new infections generated on average by each infection, yeah? And in the Th1-biased case they do this by </w:t>
-      </w:r>
-      <w:proofErr w:type="spellStart"/>
-      <w:r>
-        <w:t>maximising</w:t>
-      </w:r>
-      <w:proofErr w:type="spellEnd"/>
-      <w:r>
-        <w:t xml:space="preserve"> </w:t>
-      </w:r>
-      <w:r>
-        <w:lastRenderedPageBreak/>
-        <w:t xml:space="preserve">infection duration (to take advantage of </w:t>
-      </w:r>
-      <w:proofErr w:type="gramStart"/>
-      <w:r>
-        <w:t>a long</w:t>
-      </w:r>
-      <w:proofErr w:type="gramEnd"/>
-      <w:r>
-        <w:t xml:space="preserve">-term opportunities for transmission) while in the Th2-biased case they do this by </w:t>
-      </w:r>
-      <w:proofErr w:type="spellStart"/>
-      <w:r>
-        <w:t>maximising</w:t>
-      </w:r>
-      <w:proofErr w:type="spellEnd"/>
-      <w:r>
-        <w:t xml:space="preserve"> the probability of transmission given a contact? So, “</w:t>
-      </w:r>
-      <w:proofErr w:type="spellStart"/>
-      <w:r>
-        <w:t>maximising</w:t>
-      </w:r>
-      <w:proofErr w:type="spellEnd"/>
-      <w:r>
-        <w:t xml:space="preserve"> transmission” in only one of those cases doesn’t sound quite right to me.</w:t>
-      </w:r>
-    </w:p>
-    <w:p>
-      <w:r>
-        <w:rPr>
-          <w:i/>
-          <w:iCs/>
-        </w:rPr>
-        <w:t xml:space="preserve">Thank you for catching this sloppiness in wording. You are </w:t>
-      </w:r>
-      <w:proofErr w:type="gramStart"/>
-      <w:r>
-        <w:rPr>
-          <w:i/>
-          <w:iCs/>
-        </w:rPr>
-        <w:t>absolutely correct</w:t>
-      </w:r>
-      <w:proofErr w:type="gramEnd"/>
-      <w:r>
-        <w:rPr>
-          <w:i/>
-          <w:iCs/>
-        </w:rPr>
-        <w:t xml:space="preserve"> – evolution is maximizing the average number of new infections – so using “maximizing transmission” is not correct. What is really being increased (not maximized, another misleading word choice) in the acute infection case is </w:t>
+        <w:t xml:space="preserve">Thank you for catching this sloppiness in wording. You are absolutely correct – evolution is maximizing the average number of new infections – so using “maximizing transmission” is not correct. What is really being increased (not maximized, another misleading word choice) in the acute infection case is </w:t>
       </w:r>
       <w:r>
         <w:t>infectiousness</w:t>
@@ -197,159 +93,91 @@
       </w:r>
       <w:r>
         <w:br/>
-        <w:t>2. Does the IBM explicitly track both infected AND susceptible individuals? It’s not obvious to me if it’s important to track the latter — rather than just their total number — since they only vary in a relevant way when they get infected. That feels like it might be a strange question, but I realized I wasn’t sure about its answer in reading l. 191-195, where the description seems incomplete. In “</w:t>
-      </w:r>
-      <w:proofErr w:type="spellStart"/>
-      <w:r>
-        <w:t>creat</w:t>
-      </w:r>
-      <w:proofErr w:type="spellEnd"/>
-      <w:r>
-        <w:t>[</w:t>
-      </w:r>
-      <w:proofErr w:type="spellStart"/>
-      <w:r>
-        <w:t>ing</w:t>
-      </w:r>
-      <w:proofErr w:type="spellEnd"/>
-      <w:r>
-        <w:t>] a new infected individual”, is it the case that in addition to “</w:t>
-      </w:r>
-      <w:proofErr w:type="spellStart"/>
-      <w:r>
-        <w:t>choos</w:t>
-      </w:r>
-      <w:proofErr w:type="spellEnd"/>
-      <w:r>
-        <w:t>[</w:t>
-      </w:r>
-      <w:proofErr w:type="spellStart"/>
-      <w:r>
-        <w:t>ing</w:t>
-      </w:r>
-      <w:proofErr w:type="spellEnd"/>
-      <w:r>
-        <w:t xml:space="preserve">] an infected host at random” a susceptible host is chosen at random? Or is the algorithm simply reducing the number of </w:t>
-      </w:r>
-      <w:proofErr w:type="spellStart"/>
-      <w:r>
-        <w:t>susceptibles</w:t>
-      </w:r>
-      <w:proofErr w:type="spellEnd"/>
-      <w:r>
-        <w:t xml:space="preserve"> by 1?</w:t>
-      </w:r>
-      <w:r>
-        <w:br/>
-      </w:r>
-      <w:r>
-        <w:br/>
-        <w:t xml:space="preserve">3. l. 265, is this “high”? It’s </w:t>
-      </w:r>
-      <w:proofErr w:type="gramStart"/>
-      <w:r>
-        <w:t>definitely high</w:t>
-      </w:r>
-      <w:proofErr w:type="gramEnd"/>
-      <w:r>
-        <w:t xml:space="preserve"> relative to the min Th2=200 endpoint, but what does it translate to for average duration of infection or additional mortality rate? Also, the green points in the main panel of Figure 3 look like they range from 3e-6 to 9e-6, yet the mean virulence in the bottom left plot is on the order of 1e-4? Am I missing something? What is the “final time” in the right plot? Is it the last plotted time in the left plots? (Maybe add that detail to the caption. Update: I see that it’s named in l. 399 but I still think it could go in the caption.)</w:t>
-      </w:r>
-      <w:r>
-        <w:br/>
-      </w:r>
-      <w:r>
-        <w:br/>
-        <w:t xml:space="preserve">4. The results in l. 279-293 and Figure 4 are all very interesting but also not straightforward and could perhaps </w:t>
-      </w:r>
-      <w:proofErr w:type="gramStart"/>
-      <w:r>
-        <w:t>use</w:t>
-      </w:r>
-      <w:proofErr w:type="gramEnd"/>
-      <w:r>
-        <w:t xml:space="preserve"> more detail here (though I appreciate the flag in l. 288 to be patient as a reader!). First, I think it would help to remind the reader about what differs at time 0. If I understand correctly, the red lines are below the blue lines in Figure 4A (and vice versa for 4C) because we know (from Figure 1) that at low initial Th2, infections head towards high Th1 and high P (so lower likelihood of recovery) and at higher initial Th2, infections head towards high Th2 and zero 0 (=recovery). Then, parasite evolution in the Th1-biased scenarios is towards lower virulence. Intuitively, this should lead to lower parasite biomass (and it does, Fig 4C), but one might also expect lower biomass to equate to higher </w:t>
-      </w:r>
+        <w:t>2. Does the IBM explicitly track both infected AND susceptible individuals? It’s not obvious to me if it’s important to track the latter — rather than just their total number — since they only vary in a relevant way when they get infected. That feels like it might be a strange question, but I realized I wasn’t sure about its answer in reading l. 191-195, where the description seems incomplete. In “creat[ing] a new infected individual”, is it the case that in addition to “choos[ing] an infected host at random” a susceptible host is chosen at random? Or is the algorithm simply reducing the number of susceptibles by 1?</w:t>
+      </w:r>
+    </w:p>
+    <w:p>
+      <w:r>
+        <w:rPr>
+          <w:i/>
+          <w:iCs/>
+        </w:rPr>
+        <w:t xml:space="preserve">All susceptible hosts are treated as identical, so the algorithm is simply reducing the number of susceptibles by 1. </w:t>
+      </w:r>
+      <w:r>
+        <w:rPr>
+          <w:i/>
+          <w:iCs/>
+        </w:rPr>
+        <w:t xml:space="preserve">We have added the following parenthetical to the sentence describing how we choose an infected host at random: </w:t>
+      </w:r>
+      <w:r>
+        <w:rPr>
+          <w:i/>
+          <w:iCs/>
+        </w:rPr>
+        <w:t>“</w:t>
+      </w:r>
+      <w:r>
+        <w:rPr>
+          <w:rFonts w:eastAsiaTheme="minorEastAsia"/>
+          <w:i/>
+          <w:iCs/>
+        </w:rPr>
+        <w:t>(we do not need to choose a susceptible host at random as well, as all susceptible hosts are identical, so we only track their abundance)</w:t>
+      </w:r>
+      <w:r>
+        <w:t xml:space="preserve">” </w:t>
+      </w:r>
+      <w:r>
+        <w:rPr>
+          <w:i/>
+          <w:iCs/>
+        </w:rPr>
+        <w:t>and we add the missing piece that we reduce the size of the susceptible population by one when infection is successful.</w:t>
+      </w:r>
+      <w:r>
+        <w:br/>
+      </w:r>
+      <w:r>
+        <w:br/>
+        <w:t>3. l. 265, is this “high”? It’s definitely high relative to the min Th2=200 endpoint, but what does it translate to for average duration of infection or additional mortality rate? Also, the green points in the main panel of Figure 3 look like they range from 3e-6 to 9e-6, yet the mean virulence in the bottom left plot is on the order of 1e-4? Am I missing something? What is the “final time” in the right plot? Is it the last plotted time in the left plots? (Maybe add that detail to the caption. Update: I see that it’s named in l. 399 but I still think it could go in the caption.)</w:t>
+      </w:r>
+    </w:p>
+    <w:p>
+      <w:pPr>
+        <w:rPr>
+          <w:i/>
+          <w:iCs/>
+        </w:rPr>
+      </w:pPr>
+      <w:r>
+        <w:rPr>
+          <w:i/>
+          <w:iCs/>
+        </w:rPr>
+        <w:t>To deal with the easier issue first: thank you for noticing the discrepancy between the virulence presented in the left column of figures compared to the main figure. The issue was just that we accidentally divided the average virulence by 100</w:t>
+      </w:r>
+    </w:p>
+    <w:p>
       <w:r>
         <w:lastRenderedPageBreak/>
-        <w:t xml:space="preserve">likelihood of recovery and the opposite effect is seen. I realize this occurs because of the </w:t>
-      </w:r>
-      <w:proofErr w:type="gramStart"/>
-      <w:r>
-        <w:t>feedbacks</w:t>
-      </w:r>
-      <w:proofErr w:type="gramEnd"/>
-      <w:r>
-        <w:t xml:space="preserve"> between biomass and the stimulation of immunity, but I wonder if it’s possible to dig into this outcome a bit more to help the reader understand how lower biomasses stay under the radar of immunity. I found the mechanisms underlying the results in the Th2-biased scenario to be very clearly explained (l. 372-379) but the Th1 results remain a bit </w:t>
-      </w:r>
-      <w:proofErr w:type="gramStart"/>
-      <w:r>
-        <w:t>more hazy</w:t>
-      </w:r>
-      <w:proofErr w:type="gramEnd"/>
-      <w:r>
-        <w:t>.</w:t>
-      </w:r>
-      <w:r>
-        <w:br/>
-      </w:r>
-      <w:r>
-        <w:br/>
-        <w:t xml:space="preserve">5. A few other thoughts about Figure 4. These plots got me wondering about whether infection duration is most influenced by recovery or virulence. I assume the answer to that question depends on which </w:t>
-      </w:r>
-      <w:proofErr w:type="spellStart"/>
-      <w:r>
-        <w:t>colour</w:t>
-      </w:r>
-      <w:proofErr w:type="spellEnd"/>
-      <w:r>
-        <w:t xml:space="preserve"> line we’re talking about in Figure 4B. Could these contributions be partitioned and is that interesting/helpful? Also, it’s a bit tricky for my brain that parasite fitness goes up (or at least, we would expect it to go up) as you move up the y-axis in two of these plots, but we’d expect it to go down in the first plot. Maybe worth pointing that out somewhere even if the plots stay the same.</w:t>
-      </w:r>
-      <w:r>
-        <w:br/>
-      </w:r>
-      <w:r>
-        <w:br/>
-        <w:t xml:space="preserve">6. Totally fair that the parameters are not meant to represent any </w:t>
-      </w:r>
-      <w:proofErr w:type="gramStart"/>
-      <w:r>
-        <w:t>particular system</w:t>
-      </w:r>
-      <w:proofErr w:type="gramEnd"/>
-      <w:r>
-        <w:t xml:space="preserve"> (l. 154-156). I’m curious though what immunity looks like in this model in the absence of infection? With </w:t>
-      </w:r>
-      <w:proofErr w:type="gramStart"/>
-      <w:r>
-        <w:t>the feedback</w:t>
-      </w:r>
-      <w:proofErr w:type="gramEnd"/>
-      <w:r>
-        <w:t xml:space="preserve"> loops it’s not super trivial to intuit (for me, anyway). Similarly, how does </w:t>
-      </w:r>
-      <w:proofErr w:type="spellStart"/>
-      <w:r>
-        <w:t>polarisation</w:t>
-      </w:r>
-      <w:proofErr w:type="spellEnd"/>
-      <w:r>
-        <w:t xml:space="preserve"> change over the course of an infection (on either side of the initial condition spectrum)? The discussion in l. 440-447 is </w:t>
-      </w:r>
-      <w:proofErr w:type="gramStart"/>
-      <w:r>
-        <w:t>really interesting</w:t>
-      </w:r>
-      <w:proofErr w:type="gramEnd"/>
-      <w:r>
-        <w:t xml:space="preserve">, but I wonder if you need Tregs in the model to do this? Could the initial immune state of susceptible hosts be set to whatever it is when they recovered from a previous infection? I suppose you’d want that to decay </w:t>
-      </w:r>
-      <w:proofErr w:type="gramStart"/>
-      <w:r>
-        <w:t>over time</w:t>
-      </w:r>
-      <w:proofErr w:type="gramEnd"/>
-      <w:r>
-        <w:t xml:space="preserve"> and maybe Tregs could get you to whatever ‘baseline’ is faster? In any case, could you speculate about the extent to which results would vary if immunity was not (essentially) reset post-infection?</w:t>
+        <w:br/>
+        <w:t>4. The results in l. 279-293 and Figure 4 are all very interesting but also not straightforward and could perhaps use more detail here (though I appreciate the flag in l. 288 to be patient as a reader!). First, I think it would help to remind the reader about what differs at time 0. If I understand correctly, the red lines are below the blue lines in Figure 4A (and vice versa for 4C) because we know (from Figure 1) that at low initial Th2, infections head towards high Th1 and high P (so lower likelihood of recovery) and at higher initial Th2, infections head towards high Th2 and zero 0 (=recovery). Then, parasite evolution in the Th1-biased scenarios is towards lower virulence. Intuitively, this should lead to lower parasite biomass (and it does, Fig 4C), but one might also expect lower biomass to equate to higher likelihood of recovery and the opposite effect is seen. I realize this occurs because of the feedbacks between biomass and the stimulation of immunity, but I wonder if it’s possible to dig into this outcome a bit more to help the reader understand how lower biomasses stay under the radar of immunity. I found the mechanisms underlying the results in the Th2-biased scenario to be very clearly explained (l. 372-379) but the Th1 results remain a bit more hazy.</w:t>
+      </w:r>
+      <w:r>
+        <w:br/>
+      </w:r>
+      <w:r>
+        <w:br/>
+        <w:t>5. A few other thoughts about Figure 4. These plots got me wondering about whether infection duration is most influenced by recovery or virulence. I assume the answer to that question depends on which colour line we’re talking about in Figure 4B. Could these contributions be partitioned and is that interesting/helpful? Also, it’s a bit tricky for my brain that parasite fitness goes up (or at least, we would expect it to go up) as you move up the y-axis in two of these plots, but we’d expect it to go down in the first plot. Maybe worth pointing that out somewhere even if the plots stay the same.</w:t>
+      </w:r>
+      <w:r>
+        <w:br/>
+      </w:r>
+      <w:r>
+        <w:br/>
+        <w:t>6. Totally fair that the parameters are not meant to represent any particular system (l. 154-156). I’m curious though what immunity looks like in this model in the absence of infection? With the feedback loops it’s not super trivial to intuit (for me, anyway). Similarly, how does polarisation change over the course of an infection (on either side of the initial condition spectrum)? The discussion in l. 440-447 is really interesting, but I wonder if you need Tregs in the model to do this? Could the initial immune state of susceptible hosts be set to whatever it is when they recovered from a previous infection? I suppose you’d want that to decay over time and maybe Tregs could get you to whatever ‘baseline’ is faster? In any case, could you speculate about the extent to which results would vary if immunity was not (essentially) reset post-infection?</w:t>
       </w:r>
       <w:r>
         <w:br/>
@@ -360,7 +188,11 @@
       </w:r>
       <w:r>
         <w:br/>
-        <w:t>- Figure 1A, is that a strip of red on the right end of the gray space or something funky going on with the plotting? If it’s the former, what’s up with that?! How does that happen?</w:t>
+        <w:t xml:space="preserve">- Figure 1A, is that a strip of red on the right end of the gray space or something funky going </w:t>
+      </w:r>
+      <w:r>
+        <w:lastRenderedPageBreak/>
+        <w:t>on with the plotting? If it’s the former, what’s up with that?! How does that happen?</w:t>
       </w:r>
       <w:r>
         <w:br/>
@@ -387,123 +219,77 @@
         <w:br/>
       </w:r>
       <w:r>
+        <w:br/>
+        <w:t>- l. 277,  says “first 500 time steps”, but the plots look like stop at 450?</w:t>
+      </w:r>
+      <w:r>
+        <w:br/>
+      </w:r>
+      <w:r>
+        <w:br/>
+        <w:t>- l. 356, I’m not sure I know what a “nutritional plane” is.</w:t>
+      </w:r>
+      <w:r>
+        <w:br/>
+      </w:r>
+      <w:r>
+        <w:br/>
+        <w:t>- l. 363, should these references should be to Figures 5A and 5B?</w:t>
+      </w:r>
+      <w:r>
+        <w:br/>
+      </w:r>
+      <w:r>
+        <w:br/>
+        <w:t>- I know this may not be standard, but I use “parasite” and “pathogen” interchangeably, so l.476-478 reads funny to me (without more specificity in which “pathogens” we are talking about).</w:t>
+      </w:r>
+      <w:r>
+        <w:br/>
+      </w:r>
+      <w:r>
+        <w:br/>
+        <w:t>- There is a *lot* of stuff at the GitHub link. I wonder if it was all intended to be available to readers?</w:t>
+      </w:r>
+      <w:r>
+        <w:br/>
+      </w:r>
+      <w:r>
+        <w:br/>
+      </w:r>
+      <w:r>
+        <w:br/>
+        <w:t>Referee: 2</w:t>
+      </w:r>
+      <w:r>
+        <w:br/>
+      </w:r>
+      <w:r>
+        <w:br/>
+        <w:t>Comments to Author(s)</w:t>
+      </w:r>
+      <w:r>
+        <w:br/>
+      </w:r>
+      <w:r>
+        <w:br/>
+        <w:t>The manuscript be Cressler at al builds on classic epidemiological theory by challenging its two assumptions around probablity of recovery and recover rate. They put forward a new model which embraces immune heterogeneity. Whilst I do not have the expertise to comment in any depth on the modelling approach I do have some questions and comments which I hope will help with the clarity of their work.</w:t>
+      </w:r>
+      <w:r>
+        <w:br/>
+      </w:r>
+      <w:r>
+        <w:br/>
+        <w:t>1. There are two things I would highlight in the Abstract to help the reader going forward:</w:t>
+      </w:r>
+      <w:r>
+        <w:br/>
+        <w:t>a). That the model is develop for multicellular parasites ie it is written in the context of parasites that do not multiply within their hosts</w:t>
+      </w:r>
+      <w:r>
+        <w:br/>
+      </w:r>
+      <w:r>
         <w:lastRenderedPageBreak/>
-        <w:br/>
-        <w:t xml:space="preserve">- l. </w:t>
-      </w:r>
-      <w:proofErr w:type="gramStart"/>
-      <w:r>
-        <w:t>277,  says</w:t>
-      </w:r>
-      <w:proofErr w:type="gramEnd"/>
-      <w:r>
-        <w:t xml:space="preserve"> “first 500 time steps”, but the plots look like stop at 450?</w:t>
-      </w:r>
-      <w:r>
-        <w:br/>
-      </w:r>
-      <w:r>
-        <w:br/>
-        <w:t>- l. 356, I’m not sure I know what a “nutritional plane” is.</w:t>
-      </w:r>
-      <w:r>
-        <w:br/>
-      </w:r>
-      <w:r>
-        <w:br/>
-        <w:t>- l. 363, should these references should be to Figures 5A and 5B?</w:t>
-      </w:r>
-      <w:r>
-        <w:br/>
-      </w:r>
-      <w:r>
-        <w:br/>
-        <w:t>- I know this may not be standard, but I use “parasite” and “pathogen” interchangeably, so l.476-478 reads funny to me (without more specificity in which “pathogens” we are talking about).</w:t>
-      </w:r>
-      <w:r>
-        <w:br/>
-      </w:r>
-      <w:r>
-        <w:br/>
-        <w:t>- There is a *lot* of stuff at the GitHub link. I wonder if it was all intended to be available to readers?</w:t>
-      </w:r>
-      <w:r>
-        <w:br/>
-      </w:r>
-      <w:r>
-        <w:br/>
-      </w:r>
-      <w:r>
-        <w:br/>
-        <w:t>Referee: 2</w:t>
-      </w:r>
-      <w:r>
-        <w:br/>
-      </w:r>
-      <w:r>
-        <w:br/>
-        <w:t>Comments to Author(s)</w:t>
-      </w:r>
-      <w:r>
-        <w:br/>
-      </w:r>
-      <w:r>
-        <w:br/>
-        <w:t xml:space="preserve">The manuscript be Cressler at </w:t>
-      </w:r>
-      <w:proofErr w:type="gramStart"/>
-      <w:r>
-        <w:t>al</w:t>
-      </w:r>
-      <w:proofErr w:type="gramEnd"/>
-      <w:r>
-        <w:t xml:space="preserve"> builds on classic epidemiological theory by challenging its two assumptions around </w:t>
-      </w:r>
-      <w:proofErr w:type="spellStart"/>
-      <w:r>
-        <w:t>probablity</w:t>
-      </w:r>
-      <w:proofErr w:type="spellEnd"/>
-      <w:r>
-        <w:t xml:space="preserve"> of recovery and recover rate. They put forward a new model which embraces immune heterogeneity. Whilst I do not have the expertise to comment in any depth on the modelling </w:t>
-      </w:r>
-      <w:proofErr w:type="gramStart"/>
-      <w:r>
-        <w:t>approach</w:t>
-      </w:r>
-      <w:proofErr w:type="gramEnd"/>
-      <w:r>
-        <w:t xml:space="preserve"> I do have some questions and comments which I hope will help with the clarity of their work.</w:t>
-      </w:r>
-      <w:r>
-        <w:br/>
-      </w:r>
-      <w:r>
-        <w:br/>
-        <w:t xml:space="preserve">1. There are two things I would highlight in the Abstract to help the reader </w:t>
-      </w:r>
-      <w:proofErr w:type="gramStart"/>
-      <w:r>
-        <w:t>going</w:t>
-      </w:r>
-      <w:proofErr w:type="gramEnd"/>
-      <w:r>
-        <w:t xml:space="preserve"> forward:</w:t>
-      </w:r>
-      <w:r>
-        <w:br/>
-        <w:t xml:space="preserve">a). That the model is develop for multicellular parasites </w:t>
-      </w:r>
-      <w:proofErr w:type="spellStart"/>
-      <w:r>
-        <w:t>ie</w:t>
-      </w:r>
-      <w:proofErr w:type="spellEnd"/>
-      <w:r>
-        <w:t xml:space="preserve"> it is written in the context of parasites that do not multiply within their hosts</w:t>
-      </w:r>
-      <w:r>
-        <w:br/>
         <w:t>b) Include an early definition of “recovery” (lines26-28; lines 52-53 in introduction). I believe the authors are using this in the context of worm cure/expulsion however from a host’s point of view this would also refer to the resolution of parasite -driven pathology after the parasite has been eliminated.</w:t>
       </w:r>
       <w:r>
@@ -511,93 +297,28 @@
       </w:r>
       <w:r>
         <w:br/>
-        <w:t xml:space="preserve">2. Line 209: It is unclear how the authors envisage antigen specificity fitting with their concept of “initial Th1 and Th2 numbers”. Are they suggesting that previous infections establish these initial T helper cell </w:t>
-      </w:r>
-      <w:proofErr w:type="spellStart"/>
-      <w:r>
-        <w:t>polarised</w:t>
-      </w:r>
-      <w:proofErr w:type="spellEnd"/>
-      <w:r>
-        <w:t xml:space="preserve"> states before (and so will not have antigen specificity for the incoming infection they are modelling), for example, helminth infection? Please clarify what “initial” refers to: a helminth-naïve host, or a reinfection model?</w:t>
-      </w:r>
-      <w:r>
-        <w:br/>
-      </w:r>
-      <w:r>
-        <w:lastRenderedPageBreak/>
-        <w:br/>
-        <w:t>Note – it is also possible to have interferon-type responses co-existing with mucosal Th2 responses (</w:t>
-      </w:r>
-      <w:proofErr w:type="spellStart"/>
-      <w:r>
-        <w:t>eg</w:t>
-      </w:r>
-      <w:proofErr w:type="spellEnd"/>
-      <w:r>
-        <w:t xml:space="preserve"> M. O. Burgess et al., Helminth induced monocytosis conveys protection from respiratory syncytial virus infection in mice. Allergy 79, 2157-2172 (2024)) so how does this fit with their idea that viral infections predispose to chronic low virulence parasite infections.  Should these nuances be acknowledged in the discussion?.</w:t>
-      </w:r>
-      <w:r>
-        <w:br/>
-      </w:r>
-      <w:r>
-        <w:br/>
-        <w:t xml:space="preserve">3. Lines 353- I struggled with the concept that acute infections </w:t>
-      </w:r>
-      <w:proofErr w:type="gramStart"/>
-      <w:r>
-        <w:t>leads</w:t>
-      </w:r>
-      <w:proofErr w:type="gramEnd"/>
-      <w:r>
-        <w:t xml:space="preserve"> to evolution of higher virulence increasing transmission rate as surely this would only apply to parasites with a particular </w:t>
-      </w:r>
-      <w:proofErr w:type="gramStart"/>
-      <w:r>
-        <w:t>life style</w:t>
-      </w:r>
-      <w:proofErr w:type="gramEnd"/>
-      <w:r>
-        <w:t xml:space="preserve"> strategy </w:t>
-      </w:r>
-      <w:proofErr w:type="spellStart"/>
-      <w:r>
-        <w:t>eg</w:t>
-      </w:r>
-      <w:proofErr w:type="spellEnd"/>
-      <w:r>
-        <w:t xml:space="preserve"> Trichinella which needs its host to die to enable transmission. For most parasitic helminths, acute infections mean the worm is expelled before the egg-laying adult stage and so would prevent transmission. Most parasites do not want to kill their host, so how can increasing virulence also increase transmission?</w:t>
-      </w:r>
-      <w:r>
-        <w:br/>
-      </w:r>
-      <w:r>
-        <w:br/>
-        <w:t xml:space="preserve">4. The discussion tackles the importance of introducing T regulatory cells and the regulated immune state </w:t>
-      </w:r>
-      <w:proofErr w:type="gramStart"/>
-      <w:r>
-        <w:t>in to</w:t>
-      </w:r>
-      <w:proofErr w:type="gramEnd"/>
-      <w:r>
-        <w:t xml:space="preserve"> their model systems and I think this will be </w:t>
-      </w:r>
-      <w:proofErr w:type="gramStart"/>
-      <w:r>
-        <w:t>really interesting</w:t>
-      </w:r>
-      <w:proofErr w:type="gramEnd"/>
-      <w:r>
-        <w:t xml:space="preserve"> to see how the model then plays out.  I did wonder whether there was space within the discussion to be more visionary in terms of how the improved modelling approaches could be deployed to achieve impact in the context of predicting how parasites will evolve </w:t>
-      </w:r>
-      <w:proofErr w:type="spellStart"/>
-      <w:r>
-        <w:t>ie</w:t>
-      </w:r>
-      <w:proofErr w:type="spellEnd"/>
-      <w:r>
-        <w:t xml:space="preserve"> why is it useful to do this?</w:t>
+        <w:t>2. Line 209: It is unclear how the authors envisage antigen specificity fitting with their concept of “initial Th1 and Th2 numbers”. Are they suggesting that previous infections establish these initial T helper cell polarised states before (and so will not have antigen specificity for the incoming infection they are modelling), for example, helminth infection? Please clarify what “initial” refers to: a helminth-naïve host, or a reinfection model?</w:t>
+      </w:r>
+      <w:r>
+        <w:br/>
+      </w:r>
+      <w:r>
+        <w:br/>
+        <w:t>Note – it is also possible to have interferon-type responses co-existing with mucosal Th2 responses (eg M. O. Burgess et al., Helminth induced monocytosis conveys protection from respiratory syncytial virus infection in mice. Allergy 79, 2157-2172 (2024)) so how does this fit with their idea that viral infections predispose to chronic low virulence parasite infections.  Should these nuances be acknowledged in the discussion?.</w:t>
+      </w:r>
+      <w:r>
+        <w:br/>
+      </w:r>
+      <w:r>
+        <w:br/>
+        <w:t>3. Lines 353- I struggled with the concept that acute infections leads to evolution of higher virulence increasing transmission rate as surely this would only apply to parasites with a particular life style strategy eg Trichinella which needs its host to die to enable transmission. For most parasitic helminths, acute infections mean the worm is expelled before the egg-laying adult stage and so would prevent transmission. Most parasites do not want to kill their host, so how can increasing virulence also increase transmission?</w:t>
+      </w:r>
+      <w:r>
+        <w:br/>
+      </w:r>
+      <w:r>
+        <w:br/>
+        <w:t>4. The discussion tackles the importance of introducing T regulatory cells and the regulated immune state in to their model systems and I think this will be really interesting to see how the model then plays out.  I did wonder whether there was space within the discussion to be more visionary in terms of how the improved modelling approaches could be deployed to achieve impact in the context of predicting how parasites will evolve ie why is it useful to do this?</w:t>
       </w:r>
       <w:r>
         <w:br/>
@@ -608,15 +329,7 @@
       </w:r>
       <w:r>
         <w:br/>
-        <w:t xml:space="preserve">Line 41. Why “parasites and pathogens”? aren’t parasites pathogens? From the discussion I can see the authors feel these are not overlapping </w:t>
-      </w:r>
-      <w:proofErr w:type="gramStart"/>
-      <w:r>
-        <w:t>terms</w:t>
-      </w:r>
-      <w:proofErr w:type="gramEnd"/>
-      <w:r>
-        <w:t xml:space="preserve"> but it would be useful to clarify.</w:t>
+        <w:t>Line 41. Why “parasites and pathogens”? aren’t parasites pathogens? From the discussion I can see the authors feel these are not overlapping terms but it would be useful to clarify.</w:t>
       </w:r>
       <w:r>
         <w:br/>
@@ -1239,6 +952,7 @@
   <w:style w:type="character" w:default="1" w:styleId="DefaultParagraphFont">
     <w:name w:val="Default Paragraph Font"/>
     <w:uiPriority w:val="1"/>
+    <w:semiHidden/>
     <w:unhideWhenUsed/>
   </w:style>
   <w:style w:type="table" w:default="1" w:styleId="TableNormal">

</xml_diff>

<commit_message>
Post Ecology of Expulsion meeting reviewer comments
</commit_message>
<xml_diff>
--- a/Cressler_et_al_reviewer_response.docx
+++ b/Cressler_et_al_reviewer_response.docx
@@ -1,6 +1,6 @@
 
 <file path=word/document.xml><?xml version="1.0" encoding="utf-8"?>
-<w:document xmlns:wpc="http://schemas.microsoft.com/office/word/2010/wordprocessingCanvas" xmlns:cx="http://schemas.microsoft.com/office/drawing/2014/chartex" xmlns:cx1="http://schemas.microsoft.com/office/drawing/2015/9/8/chartex" xmlns:cx2="http://schemas.microsoft.com/office/drawing/2015/10/21/chartex" xmlns:cx3="http://schemas.microsoft.com/office/drawing/2016/5/9/chartex" xmlns:cx4="http://schemas.microsoft.com/office/drawing/2016/5/10/chartex" xmlns:cx5="http://schemas.microsoft.com/office/drawing/2016/5/11/chartex" xmlns:cx6="http://schemas.microsoft.com/office/drawing/2016/5/12/chartex" xmlns:cx7="http://schemas.microsoft.com/office/drawing/2016/5/13/chartex" xmlns:cx8="http://schemas.microsoft.com/office/drawing/2016/5/14/chartex" xmlns:mc="http://schemas.openxmlformats.org/markup-compatibility/2006" xmlns:aink="http://schemas.microsoft.com/office/drawing/2016/ink" xmlns:am3d="http://schemas.microsoft.com/office/drawing/2017/model3d" xmlns:o="urn:schemas-microsoft-com:office:office" xmlns:oel="http://schemas.microsoft.com/office/2019/extlst" xmlns:r="http://schemas.openxmlformats.org/officeDocument/2006/relationships" xmlns:m="http://schemas.openxmlformats.org/officeDocument/2006/math" xmlns:v="urn:schemas-microsoft-com:vml" xmlns:wp14="http://schemas.microsoft.com/office/word/2010/wordprocessingDrawing" xmlns:wp="http://schemas.openxmlformats.org/drawingml/2006/wordprocessingDrawing" xmlns:w10="urn:schemas-microsoft-com:office:word" xmlns:w="http://schemas.openxmlformats.org/wordprocessingml/2006/main" xmlns:w14="http://schemas.microsoft.com/office/word/2010/wordml" xmlns:w15="http://schemas.microsoft.com/office/word/2012/wordml" xmlns:w16cex="http://schemas.microsoft.com/office/word/2018/wordml/cex" xmlns:w16cid="http://schemas.microsoft.com/office/word/2016/wordml/cid" xmlns:w16="http://schemas.microsoft.com/office/word/2018/wordml" xmlns:w16du="http://schemas.microsoft.com/office/word/2023/wordml/word16du" xmlns:w16sdtdh="http://schemas.microsoft.com/office/word/2020/wordml/sdtdatahash" xmlns:w16se="http://schemas.microsoft.com/office/word/2015/wordml/symex" xmlns:wpg="http://schemas.microsoft.com/office/word/2010/wordprocessingGroup" xmlns:wpi="http://schemas.microsoft.com/office/word/2010/wordprocessingInk" xmlns:wne="http://schemas.microsoft.com/office/word/2006/wordml" xmlns:wps="http://schemas.microsoft.com/office/word/2010/wordprocessingShape" mc:Ignorable="w14 w15 w16se w16cid w16 w16cex w16sdtdh w16du wp14">
+<w:document xmlns:wpc="http://schemas.microsoft.com/office/word/2010/wordprocessingCanvas" xmlns:cx="http://schemas.microsoft.com/office/drawing/2014/chartex" xmlns:cx1="http://schemas.microsoft.com/office/drawing/2015/9/8/chartex" xmlns:cx2="http://schemas.microsoft.com/office/drawing/2015/10/21/chartex" xmlns:cx3="http://schemas.microsoft.com/office/drawing/2016/5/9/chartex" xmlns:cx4="http://schemas.microsoft.com/office/drawing/2016/5/10/chartex" xmlns:cx5="http://schemas.microsoft.com/office/drawing/2016/5/11/chartex" xmlns:cx6="http://schemas.microsoft.com/office/drawing/2016/5/12/chartex" xmlns:cx7="http://schemas.microsoft.com/office/drawing/2016/5/13/chartex" xmlns:cx8="http://schemas.microsoft.com/office/drawing/2016/5/14/chartex" xmlns:mc="http://schemas.openxmlformats.org/markup-compatibility/2006" xmlns:aink="http://schemas.microsoft.com/office/drawing/2016/ink" xmlns:am3d="http://schemas.microsoft.com/office/drawing/2017/model3d" xmlns:o="urn:schemas-microsoft-com:office:office" xmlns:oel="http://schemas.microsoft.com/office/2019/extlst" xmlns:r="http://schemas.openxmlformats.org/officeDocument/2006/relationships" xmlns:m="http://schemas.openxmlformats.org/officeDocument/2006/math" xmlns:v="urn:schemas-microsoft-com:vml" xmlns:wp14="http://schemas.microsoft.com/office/word/2010/wordprocessingDrawing" xmlns:wp="http://schemas.openxmlformats.org/drawingml/2006/wordprocessingDrawing" xmlns:w10="urn:schemas-microsoft-com:office:word" xmlns:w="http://schemas.openxmlformats.org/wordprocessingml/2006/main" xmlns:w14="http://schemas.microsoft.com/office/word/2010/wordml" xmlns:w15="http://schemas.microsoft.com/office/word/2012/wordml" xmlns:w16cex="http://schemas.microsoft.com/office/word/2018/wordml/cex" xmlns:w16cid="http://schemas.microsoft.com/office/word/2016/wordml/cid" xmlns:w16="http://schemas.microsoft.com/office/word/2018/wordml" xmlns:w16du="http://schemas.microsoft.com/office/word/2023/wordml/word16du" xmlns:w16sdtdh="http://schemas.microsoft.com/office/word/2020/wordml/sdtdatahash" xmlns:w16sdtfl="http://schemas.microsoft.com/office/word/2024/wordml/sdtformatlock" xmlns:w16se="http://schemas.microsoft.com/office/word/2015/wordml/symex" xmlns:wpg="http://schemas.microsoft.com/office/word/2010/wordprocessingGroup" xmlns:wpi="http://schemas.microsoft.com/office/word/2010/wordprocessingInk" xmlns:wne="http://schemas.microsoft.com/office/word/2006/wordml" xmlns:wps="http://schemas.microsoft.com/office/word/2010/wordprocessingShape" mc:Ignorable="w14 w15 w16se w16cid w16 w16cex w16sdtdh w16sdtfl w16du wp14">
   <w:body>
     <w:p>
       <w:r>
@@ -23,7 +23,23 @@
       </w:r>
       <w:r>
         <w:br/>
-        <w:t>The authors first show that these two sources of stochasticity can fundamentally alter the outcome of infections at the individual level, leading to acute or chronic infections, and then demonstrate that this scales up to effect epidemiological and evolutionary outcomes. A Th1 bias leads to chronic infections, high infection prevalence in the host population, and evolution of low virulence, while a Th2 bias leads to acute infections, low infection prevalence (and more frequent epidemic fade outs) and the evolution of lower virulence. The authors break down these evolutionary effects in terms of different parasite fitness components: in the Th1-biased case, longer infection durations and lower recovery probabilities pay off while in the Th2-biased case, higher peak biomass and higher transmission rates pay off. Finally, the authors use adaptive dynamics with a simplified model to show that evolutionary dynamics of virulence in response to changing the probability of recovery — and not its rate — are consistent with patterns observed in their multi-scale stochastic model.</w:t>
+        <w:t xml:space="preserve">The authors first show that these two sources of stochasticity can fundamentally alter the outcome of infections at the individual level, leading to acute or chronic infections, and then demonstrate that this scales up to effect epidemiological and evolutionary outcomes. A </w:t>
+      </w:r>
+      <w:proofErr w:type="gramStart"/>
+      <w:r>
+        <w:t>Th1 bias leads</w:t>
+      </w:r>
+      <w:proofErr w:type="gramEnd"/>
+      <w:r>
+        <w:t xml:space="preserve"> to chronic infections, high infection prevalence in the host population, and evolution of low virulence, while a Th2 bias leads to acute infections, low infection prevalence (and more frequent epidemic fade </w:t>
+      </w:r>
+      <w:proofErr w:type="gramStart"/>
+      <w:r>
+        <w:t>outs</w:t>
+      </w:r>
+      <w:proofErr w:type="gramEnd"/>
+      <w:r>
+        <w:t>) and the evolution of lower virulence. The authors break down these evolutionary effects in terms of different parasite fitness components: in the Th1-biased case, longer infection durations and lower recovery probabilities pay off while in the Th2-biased case, higher peak biomass and higher transmission rates pay off. Finally, the authors use adaptive dynamics with a simplified model to show that evolutionary dynamics of virulence in response to changing the probability of recovery — and not its rate — are consistent with patterns observed in their multi-scale stochastic model.</w:t>
       </w:r>
       <w:r>
         <w:br/>
@@ -48,7 +64,23 @@
           <w:i/>
           <w:iCs/>
         </w:rPr>
-        <w:t>We sincerely thank the reviewer for their enthusiasm for our work! We are really gratified to hear that they found it as interesting as we did!</w:t>
+        <w:t xml:space="preserve">We sincerely thank the </w:t>
+      </w:r>
+      <w:proofErr w:type="gramStart"/>
+      <w:r>
+        <w:rPr>
+          <w:i/>
+          <w:iCs/>
+        </w:rPr>
+        <w:t>reviewer</w:t>
+      </w:r>
+      <w:proofErr w:type="gramEnd"/>
+      <w:r>
+        <w:rPr>
+          <w:i/>
+          <w:iCs/>
+        </w:rPr>
+        <w:t xml:space="preserve"> for their enthusiasm for our work! We are really gratified to hear that they found it as interesting as we did!</w:t>
       </w:r>
     </w:p>
     <w:p>
@@ -61,7 +93,15 @@
       </w:r>
       <w:r>
         <w:br/>
-        <w:t xml:space="preserve">1. I’m curious about the language used to describe what is being maximized by the parasites in the different cases (e.g., l. 108-111, l. 409-412). Presumably the evolved strategies in each case are </w:t>
+        <w:t xml:space="preserve">1. I’m curious about the language used to describe what is being maximized by </w:t>
+      </w:r>
+      <w:proofErr w:type="gramStart"/>
+      <w:r>
+        <w:t>the parasites</w:t>
+      </w:r>
+      <w:proofErr w:type="gramEnd"/>
+      <w:r>
+        <w:t xml:space="preserve"> in the different cases (e.g., l. 108-111, l. 409-412). Presumably the evolved strategies in each case are </w:t>
       </w:r>
       <w:proofErr w:type="spellStart"/>
       <w:r>
@@ -81,7 +121,15 @@
       </w:r>
       <w:r>
         <w:lastRenderedPageBreak/>
-        <w:t xml:space="preserve">infection duration (to take advantage of a long-term opportunities for transmission) while in the Th2-biased case they do this by </w:t>
+        <w:t xml:space="preserve">infection duration (to take advantage of </w:t>
+      </w:r>
+      <w:proofErr w:type="gramStart"/>
+      <w:r>
+        <w:t>a long</w:t>
+      </w:r>
+      <w:proofErr w:type="gramEnd"/>
+      <w:r>
+        <w:t xml:space="preserve">-term opportunities for transmission) while in the Th2-biased case they do this by </w:t>
       </w:r>
       <w:proofErr w:type="spellStart"/>
       <w:r>
@@ -360,7 +408,15 @@
     <w:p>
       <w:r>
         <w:br/>
-        <w:t xml:space="preserve">4. The results in l. 279-293 and Figure 4 are all very interesting but also not straightforward and could perhaps use more detail here (though I appreciate the flag in l. 288 to be patient as a reader!). First, I think it would help to remind the reader about what differs at time 0. If I understand correctly, the red lines are below the blue lines in Figure 4A (and vice versa for 4C) because we know (from Figure 1) that at low initial Th2, infections head towards high Th1 and high P (so lower likelihood of recovery) and at higher initial Th2, infections head towards high Th2 and zero 0 (=recovery). Then, parasite evolution in the Th1-biased scenarios is towards lower virulence. Intuitively, this should lead to lower parasite biomass (and it does, Fig 4C), but one might also expect lower biomass to equate to higher likelihood of recovery and the opposite effect is seen. I realize this occurs because of the </w:t>
+        <w:t xml:space="preserve">4. The results in l. 279-293 and Figure 4 are all very interesting but also not straightforward and could perhaps </w:t>
+      </w:r>
+      <w:proofErr w:type="gramStart"/>
+      <w:r>
+        <w:t>use</w:t>
+      </w:r>
+      <w:proofErr w:type="gramEnd"/>
+      <w:r>
+        <w:t xml:space="preserve"> more detail here (though I appreciate the flag in l. 288 to be patient as a reader!). First, I think it would help to remind the reader about what differs at time 0. If I understand correctly, the red lines are below the blue lines in Figure 4A (and vice versa for 4C) because we know (from Figure 1) that at low initial Th2, infections head towards high Th1 and high P (so lower likelihood of recovery) and at higher initial Th2, infections head towards high Th2 and zero 0 (=recovery). Then, parasite evolution in the Th1-biased scenarios is towards lower virulence. Intuitively, this should lead to lower parasite biomass (and it does, Fig 4C), but one might also expect lower biomass to equate to higher likelihood of recovery and the opposite effect is seen. I realize this occurs because of the </w:t>
       </w:r>
       <w:proofErr w:type="gramStart"/>
       <w:r>
@@ -378,6 +434,131 @@
       <w:r>
         <w:t>.</w:t>
       </w:r>
+    </w:p>
+    <w:p>
+      <w:pPr>
+        <w:rPr>
+          <w:i/>
+          <w:iCs/>
+        </w:rPr>
+      </w:pPr>
+      <w:r>
+        <w:rPr>
+          <w:i/>
+          <w:iCs/>
+        </w:rPr>
+        <w:t>Thank you for pointing out that this was not clear to you as a reader. We have drastically rewritten this paragraph to hopefully be more careful in walking the reader through the results by setting up the initial state of the system, as you suggest</w:t>
+      </w:r>
+      <w:r>
+        <w:rPr>
+          <w:i/>
+          <w:iCs/>
+        </w:rPr>
+        <w:t xml:space="preserve">, and explaining how lower biomass reduces immune stimulation and </w:t>
+      </w:r>
+      <w:proofErr w:type="gramStart"/>
+      <w:r>
+        <w:rPr>
+          <w:i/>
+          <w:iCs/>
+        </w:rPr>
+        <w:t>thus,</w:t>
+      </w:r>
+      <w:proofErr w:type="gramEnd"/>
+      <w:r>
+        <w:rPr>
+          <w:i/>
+          <w:iCs/>
+        </w:rPr>
+        <w:t xml:space="preserve"> increases the probability of a chronic infection:</w:t>
+      </w:r>
+    </w:p>
+    <w:p>
+      <w:pPr>
+        <w:rPr>
+          <w:i/>
+          <w:iCs/>
+        </w:rPr>
+      </w:pPr>
+      <w:r>
+        <w:rPr>
+          <w:i/>
+          <w:iCs/>
+        </w:rPr>
+        <w:t xml:space="preserve">“Figure 4 visualizes how evolution of virulence across different immune landscapes modifies parasite fitness components. We examine only the first 500 timesteps of each simulation to avoid issues with right-censoring of infection duration. At the outset of the simulation (infection start time of zero), moving from Th1-biased to Th2-biased immune landscapes (going from red to blue lines) increases the probability of recovery (Fig 4A), as expected based on the results shown in Fig. 1B. We also observe a decrease in infection </w:t>
+      </w:r>
+      <w:r>
+        <w:rPr>
+          <w:i/>
+          <w:iCs/>
+        </w:rPr>
+        <w:lastRenderedPageBreak/>
+        <w:t xml:space="preserve">durations (Fig. 4B) and lower peak parasite biomass (Fig. 4C). Thus, at the outset, parasites evolving on Th1-biased landscapes are more likely to be in </w:t>
+      </w:r>
+      <w:proofErr w:type="gramStart"/>
+      <w:r>
+        <w:rPr>
+          <w:i/>
+          <w:iCs/>
+        </w:rPr>
+        <w:t>a chronic</w:t>
+      </w:r>
+      <w:proofErr w:type="gramEnd"/>
+      <w:r>
+        <w:rPr>
+          <w:i/>
+          <w:iCs/>
+        </w:rPr>
+        <w:t xml:space="preserve"> infection, whereas parasites evolving on Th2-biased landscapes are more likely to be in </w:t>
+      </w:r>
+      <w:proofErr w:type="gramStart"/>
+      <w:r>
+        <w:rPr>
+          <w:i/>
+          <w:iCs/>
+        </w:rPr>
+        <w:t>an acute</w:t>
+      </w:r>
+      <w:proofErr w:type="gramEnd"/>
+      <w:r>
+        <w:rPr>
+          <w:i/>
+          <w:iCs/>
+        </w:rPr>
+        <w:t xml:space="preserve"> infection. On Th1-biased landscapes (red lines), we see that parasite evolution towards lower virulence (Fig. 3) further reduces the probability of recovery (Fig. 4A), increases the duration of infection (Fig. 4B), and decreases the peak parasite biomass (Fig. 4C).  Note, however, that the probability of recovery remains positive, indicating that not all infections are chronic even in the most Th1-biased immune landscapes. The explanation for this pattern is that reduced virulence reduces the parasite within-host growth rate, which reduces the peak parasite biomass. This reduction in growth rate and biomass reduces the stimulation of the immune system, leading to longer infections and a reduced probability of clearance. This is visible on Fig. 1B – at low initial parasite biomass, chronic infections are more likely, and reducing the peak parasite biomass also reduces the parasite biomass upon infection. Conversely, on Th2-biased landscapes (blue lines), we see that parasite evolution towards higher virulence increases peak parasite biomass (Fig. 4C), as parasite growth rate is increased. This higher peak biomass also increases infectiousness and thus, transmission rate. Surprisingly, both the probability of recovery and infection duration remain relatively constant as virulence increases (blue lines in Fig. 4A and B), a point we return to in the Discussion. Combining the insights from Figs. 2</w:t>
+      </w:r>
+      <w:r>
+        <w:rPr>
+          <w:i/>
+          <w:iCs/>
+        </w:rPr>
+        <w:sym w:font="Symbol" w:char="F02D"/>
+      </w:r>
+      <w:r>
+        <w:rPr>
+          <w:i/>
+          <w:iCs/>
+        </w:rPr>
+        <w:t xml:space="preserve">4, we see that Th1-biased immune landscapes lead to the evolution of reduced virulence, which reduces recovery probability and increases infection duration, leading to high prevalence of infection within the host population. Th2-biased immune landscapes lead to the evolution of increased virulence, which increases peak parasite abundance, thereby increasing transmission, but without reducing the high recovery probability, which leads to low prevalence of </w:t>
+      </w:r>
+      <w:proofErr w:type="gramStart"/>
+      <w:r>
+        <w:rPr>
+          <w:i/>
+          <w:iCs/>
+        </w:rPr>
+        <w:t>infection.</w:t>
+      </w:r>
+      <w:r>
+        <w:rPr>
+          <w:i/>
+          <w:iCs/>
+        </w:rPr>
+        <w:t>”</w:t>
+      </w:r>
+      <w:proofErr w:type="gramEnd"/>
+    </w:p>
+    <w:p>
       <w:r>
         <w:br/>
       </w:r>
@@ -393,6 +574,46 @@
       <w:r>
         <w:t xml:space="preserve"> line we’re talking about in Figure 4B. Could these contributions be partitioned and is that interesting/helpful? Also, it’s a bit tricky for my brain that parasite fitness goes up (or at least, we would expect it to go up) as you move up the y-axis in two of these plots, but we’d expect it to go down in the first plot. Maybe worth pointing that out somewhere even if the plots stay the same.</w:t>
       </w:r>
+    </w:p>
+    <w:p>
+      <w:r>
+        <w:rPr>
+          <w:i/>
+          <w:iCs/>
+        </w:rPr>
+        <w:t xml:space="preserve">This is </w:t>
+      </w:r>
+      <w:proofErr w:type="gramStart"/>
+      <w:r>
+        <w:rPr>
+          <w:i/>
+          <w:iCs/>
+        </w:rPr>
+        <w:t>a really interesting</w:t>
+      </w:r>
+      <w:proofErr w:type="gramEnd"/>
+      <w:r>
+        <w:rPr>
+          <w:i/>
+          <w:iCs/>
+        </w:rPr>
+        <w:t xml:space="preserve"> suggestion, but we couldn’t really figure out how to implement it beyond what we’ve already done. The way we were trying to think about what influences infection duration was by computing the probability of recovery, since all infections end either in recovery or death. Thus, </w:t>
+      </w:r>
+      <w:r>
+        <w:rPr>
+          <w:i/>
+          <w:iCs/>
+        </w:rPr>
+        <w:t>1 – (probability of recovery) = (probability of infection-</w:t>
+      </w:r>
+      <w:r>
+        <w:rPr>
+          <w:i/>
+          <w:iCs/>
+        </w:rPr>
+        <w:lastRenderedPageBreak/>
+        <w:t xml:space="preserve">induced mortality), so it’s hard to see how to partition that further. </w:t>
+      </w:r>
       <w:r>
         <w:br/>
       </w:r>
@@ -406,16 +627,603 @@
       </w:r>
       <w:proofErr w:type="gramEnd"/>
       <w:r>
-        <w:t xml:space="preserve"> (l. 154-156). I’m curious though what immunity looks like in this model in the absence of infection? With the feedback loops it’s not super trivial to intuit (for me, anyway). Similarly, how does </w:t>
+        <w:t xml:space="preserve"> (l. 154-156). I’m curious though what immunity looks like in this model in the absence of infection? With </w:t>
+      </w:r>
+      <w:proofErr w:type="gramStart"/>
+      <w:r>
+        <w:t>the feedback</w:t>
+      </w:r>
+      <w:proofErr w:type="gramEnd"/>
+      <w:r>
+        <w:t xml:space="preserve"> loops it’s not super trivial to intuit (for me, anyway). Similarly, how does </w:t>
       </w:r>
       <w:proofErr w:type="spellStart"/>
       <w:r>
+        <w:t>polarisation</w:t>
+      </w:r>
+      <w:proofErr w:type="spellEnd"/>
+      <w:r>
+        <w:t xml:space="preserve"> change over the course of an infection (on either side of the initial condition spectrum)? The discussion in l. 440-447 is </w:t>
+      </w:r>
+      <w:proofErr w:type="gramStart"/>
+      <w:r>
+        <w:t>really interesting</w:t>
+      </w:r>
+      <w:proofErr w:type="gramEnd"/>
+      <w:r>
+        <w:t xml:space="preserve">, but I wonder if you need Tregs in the model to do this? Could the initial immune state of susceptible hosts be set to whatever it is when they recovered from a previous infection? I suppose you’d want that to decay </w:t>
+      </w:r>
+      <w:proofErr w:type="gramStart"/>
+      <w:r>
+        <w:t>over time</w:t>
+      </w:r>
+      <w:proofErr w:type="gramEnd"/>
+      <w:r>
+        <w:t xml:space="preserve"> and maybe Tregs could get you to whatever ‘baseline’ is faster? In any case, could you speculate about the extent to which results would vary if immunity was not (essentially) reset post-infection?</w:t>
+      </w:r>
+    </w:p>
+    <w:p>
+      <w:pPr>
+        <w:rPr>
+          <w:i/>
+          <w:iCs/>
+        </w:rPr>
+      </w:pPr>
+      <w:r>
+        <w:rPr>
+          <w:i/>
+          <w:iCs/>
+        </w:rPr>
+        <w:t>In the absence of infection, the immune system would remain in a “naïve” state where there are only a small number of Th1 and Th2 cells. Referencing back to Cressler et al. 2024 (where the within-host model is elaborated), in the absence of any parasite stimulation, the system remains at the equilibrium indicated by the triangle in the figure below (Fig. 1E) in Cressler et al. 2024.</w:t>
+      </w:r>
+    </w:p>
+    <w:p>
+      <w:r>
+        <w:rPr>
+          <w:noProof/>
+        </w:rPr>
+        <w:drawing>
+          <wp:inline distT="0" distB="0" distL="0" distR="0" wp14:anchorId="2145D9FA" wp14:editId="0A03B0F8">
+            <wp:extent cx="3657607" cy="3657607"/>
+            <wp:effectExtent l="0" t="0" r="0" b="0"/>
+            <wp:docPr id="1357707727" name="Picture 1"/>
+            <wp:cNvGraphicFramePr>
+              <a:graphicFrameLocks xmlns:a="http://schemas.openxmlformats.org/drawingml/2006/main" noChangeAspect="1"/>
+            </wp:cNvGraphicFramePr>
+            <a:graphic xmlns:a="http://schemas.openxmlformats.org/drawingml/2006/main">
+              <a:graphicData uri="http://schemas.openxmlformats.org/drawingml/2006/picture">
+                <pic:pic xmlns:pic="http://schemas.openxmlformats.org/drawingml/2006/picture">
+                  <pic:nvPicPr>
+                    <pic:cNvPr id="1357707727" name="Picture 1357707727"/>
+                    <pic:cNvPicPr/>
+                  </pic:nvPicPr>
+                  <pic:blipFill>
+                    <a:blip r:embed="rId4" cstate="print">
+                      <a:extLst>
+                        <a:ext uri="{28A0092B-C50C-407E-A947-70E740481C1C}">
+                          <a14:useLocalDpi xmlns:a14="http://schemas.microsoft.com/office/drawing/2010/main" val="0"/>
+                        </a:ext>
+                      </a:extLst>
+                    </a:blip>
+                    <a:stretch>
+                      <a:fillRect/>
+                    </a:stretch>
+                  </pic:blipFill>
+                  <pic:spPr>
+                    <a:xfrm>
+                      <a:off x="0" y="0"/>
+                      <a:ext cx="3657607" cy="3657607"/>
+                    </a:xfrm>
+                    <a:prstGeom prst="rect">
+                      <a:avLst/>
+                    </a:prstGeom>
+                  </pic:spPr>
+                </pic:pic>
+              </a:graphicData>
+            </a:graphic>
+          </wp:inline>
+        </w:drawing>
+      </w:r>
+      <w:r>
+        <w:br/>
+      </w:r>
+    </w:p>
+    <w:p>
+      <w:pPr>
+        <w:rPr>
+          <w:i/>
+          <w:iCs/>
+        </w:rPr>
+      </w:pPr>
+      <w:r>
+        <w:rPr>
+          <w:i/>
+          <w:iCs/>
+        </w:rPr>
         <w:lastRenderedPageBreak/>
-        <w:t>polarisation</w:t>
+        <w:t xml:space="preserve">We are not entirely sure what you mean by “how does polarization change over the course of infection.” </w:t>
+      </w:r>
+      <w:r>
+        <w:rPr>
+          <w:i/>
+          <w:iCs/>
+        </w:rPr>
+        <w:t xml:space="preserve">Based on Cressler et al. 2024, polarization appears to occur very quickly, and the model settles into an equilibrium. One of the limitations of the model in its current form is that the polarized equilibrium remains stable, even if (for example), the parasite is cleared. To help explain this, we have included the following at the end of the </w:t>
+      </w:r>
+      <w:proofErr w:type="gramStart"/>
+      <w:r>
+        <w:rPr>
+          <w:i/>
+          <w:iCs/>
+        </w:rPr>
+        <w:t>referenced</w:t>
+      </w:r>
+      <w:proofErr w:type="gramEnd"/>
+      <w:r>
+        <w:rPr>
+          <w:i/>
+          <w:iCs/>
+        </w:rPr>
+        <w:t xml:space="preserve"> paragraph:</w:t>
+      </w:r>
+    </w:p>
+    <w:p>
+      <w:pPr>
+        <w:rPr>
+          <w:rFonts w:eastAsiaTheme="minorEastAsia"/>
+          <w:i/>
+          <w:iCs/>
+        </w:rPr>
+      </w:pPr>
+      <w:r>
+        <w:rPr>
+          <w:i/>
+          <w:iCs/>
+        </w:rPr>
+        <w:t>“</w:t>
+      </w:r>
+      <w:r>
+        <w:rPr>
+          <w:rFonts w:eastAsiaTheme="minorEastAsia"/>
+          <w:i/>
+          <w:iCs/>
+        </w:rPr>
+        <w:t>The inclusion of regulatory T-cells would also address another limitation of the model, which is that the within-host model produces a stable equilibrium that is likely unrepresentative of the immune state a long time after an infection is cleared or becomes chronic. For example, if the immune system polarizes quickly towards a high Th2 response and the parasite is cleared, the immune system will remain in a high Th2 state because self-activation and cross-inhibition will remain high (see Fig. 3 in Cressler et al. 2024 for visualizations of these outcomes). Our “resetting” of immunity between infections is meant to approximate the action of regulatory T-cells.</w:t>
+      </w:r>
+      <w:r>
+        <w:rPr>
+          <w:rFonts w:eastAsiaTheme="minorEastAsia"/>
+          <w:i/>
+          <w:iCs/>
+        </w:rPr>
+        <w:t xml:space="preserve"> Were we to allow more realistic modeling of immune relaxation towards the baseline, we would likely observe larger differences from our results in the Th2-biased landscapes. This is because, after clearance, the immune systems of recovering individuals would likely be even more Th2-biased, making subsequent infections even shorter, potentially leading to the evolution of even higher virulence.”</w:t>
+      </w:r>
+    </w:p>
+    <w:p>
+      <w:r>
+        <w:t>Minor things.</w:t>
+      </w:r>
+      <w:r>
+        <w:br/>
+        <w:t>- Figure 1A, is that a strip of red on the right end of the gray space or something funky going on with the plotting? If it’s the former, what’s up with that?! How does that happen?</w:t>
+      </w:r>
+    </w:p>
+    <w:p>
+      <w:r>
+        <w:rPr>
+          <w:i/>
+          <w:iCs/>
+        </w:rPr>
+        <w:t>Fortunately, it’s funkiness with the plotting. We have fixed it in the revision!</w:t>
+      </w:r>
+      <w:r>
+        <w:br/>
+      </w:r>
+      <w:r>
+        <w:br/>
+        <w:t>- Eqn 1, the self-activation term for the T1 response, the numerator has S_1^p. Should that p be 2? I see that in the 2024 paper, p=2 was the default choice (and that it’s 2 in the T_2 equation), but I don’t see p defined in Table 1.</w:t>
+      </w:r>
+    </w:p>
+    <w:p>
+      <w:r>
+        <w:rPr>
+          <w:i/>
+          <w:iCs/>
+        </w:rPr>
+        <w:t>Thanks for catching that – we’ve corrected that in the revision so it’s S_1^2.</w:t>
+      </w:r>
+      <w:r>
+        <w:br/>
+      </w:r>
+      <w:r>
+        <w:br/>
+        <w:t xml:space="preserve">- It’s a bit unfortunate that I </w:t>
+      </w:r>
+      <w:proofErr w:type="gramStart"/>
+      <w:r>
+        <w:t>is</w:t>
+      </w:r>
+      <w:proofErr w:type="gramEnd"/>
+      <w:r>
+        <w:t xml:space="preserve"> both infected in the epi model and inhibition in the within-host model. Could change inhibition to something else — N? H?  </w:t>
+      </w:r>
+    </w:p>
+    <w:p>
+      <w:r>
+        <w:rPr>
+          <w:i/>
+          <w:iCs/>
+        </w:rPr>
+        <w:t xml:space="preserve">No problem – we’ve changed inhibition to </w:t>
+      </w:r>
+      <w:proofErr w:type="spellStart"/>
+      <w:r>
+        <w:rPr>
+          <w:i/>
+          <w:iCs/>
+        </w:rPr>
+        <w:t>H_ij</w:t>
       </w:r>
       <w:proofErr w:type="spellEnd"/>
       <w:r>
-        <w:t xml:space="preserve"> change over the course of an infection (on either side of the initial condition spectrum)? The discussion in l. 440-447 is </w:t>
+        <w:rPr>
+          <w:i/>
+          <w:iCs/>
+        </w:rPr>
+        <w:t xml:space="preserve"> to avoid confusion.</w:t>
+      </w:r>
+      <w:r>
+        <w:br/>
+      </w:r>
+      <w:r>
+        <w:br/>
+        <w:t>- l. 235, “black” should say “blue”, presumably?</w:t>
+      </w:r>
+    </w:p>
+    <w:p>
+      <w:r>
+        <w:rPr>
+          <w:i/>
+          <w:iCs/>
+        </w:rPr>
+        <w:lastRenderedPageBreak/>
+        <w:t>Fixed!</w:t>
+      </w:r>
+      <w:r>
+        <w:br/>
+      </w:r>
+      <w:r>
+        <w:br/>
+        <w:t xml:space="preserve">- l. </w:t>
+      </w:r>
+      <w:proofErr w:type="gramStart"/>
+      <w:r>
+        <w:t>277,  says</w:t>
+      </w:r>
+      <w:proofErr w:type="gramEnd"/>
+      <w:r>
+        <w:t xml:space="preserve"> “first </w:t>
+      </w:r>
+      <w:proofErr w:type="gramStart"/>
+      <w:r>
+        <w:t>500 time</w:t>
+      </w:r>
+      <w:proofErr w:type="gramEnd"/>
+      <w:r>
+        <w:t xml:space="preserve"> steps”, but the plots look like stop at 450?</w:t>
+      </w:r>
+    </w:p>
+    <w:p>
+      <w:r>
+        <w:rPr>
+          <w:i/>
+          <w:iCs/>
+        </w:rPr>
+        <w:t>It’s because of the way we “chunked” the simulation timesteps. The points at time 0 represent the averages from times 0-50, 50-100, and so on. That is why the x-axis label is infection start time.</w:t>
+      </w:r>
+      <w:r>
+        <w:rPr>
+          <w:i/>
+          <w:iCs/>
+        </w:rPr>
+        <w:tab/>
+      </w:r>
+      <w:r>
+        <w:br/>
+      </w:r>
+      <w:r>
+        <w:br/>
+        <w:t>- l. 356, I’m not sure I know what a “nutritional plane” is.</w:t>
+      </w:r>
+    </w:p>
+    <w:p>
+      <w:r>
+        <w:rPr>
+          <w:i/>
+          <w:iCs/>
+        </w:rPr>
+        <w:t>Changed to “malnutrition” to capture that we mean the host’s nutritional status.</w:t>
+      </w:r>
+      <w:r>
+        <w:br/>
+      </w:r>
+      <w:r>
+        <w:br/>
+        <w:t>- l. 363, should these references should be to Figures 5A and 5B?</w:t>
+      </w:r>
+    </w:p>
+    <w:p>
+      <w:r>
+        <w:rPr>
+          <w:i/>
+          <w:iCs/>
+        </w:rPr>
+        <w:t>Fixed!</w:t>
+      </w:r>
+      <w:r>
+        <w:br/>
+      </w:r>
+      <w:r>
+        <w:br/>
+        <w:t>- I know this may not be standard, but I use “parasite” and “pathogen” interchangeably, so l.476-478 reads funny to me (without more specificity in which “pathogens” we are talking about).</w:t>
+      </w:r>
+    </w:p>
+    <w:p>
+      <w:r>
+        <w:rPr>
+          <w:i/>
+          <w:iCs/>
+        </w:rPr>
+        <w:t xml:space="preserve">We have modified this to read as </w:t>
+      </w:r>
+      <w:proofErr w:type="spellStart"/>
+      <w:r>
+        <w:rPr>
+          <w:i/>
+          <w:iCs/>
+        </w:rPr>
+        <w:t>macroparasites</w:t>
+      </w:r>
+      <w:proofErr w:type="spellEnd"/>
+      <w:r>
+        <w:rPr>
+          <w:i/>
+          <w:iCs/>
+        </w:rPr>
+        <w:t xml:space="preserve"> and microparasites, with viruses as an example of microparasites.</w:t>
+      </w:r>
+      <w:r>
+        <w:br/>
+      </w:r>
+      <w:r>
+        <w:br/>
+        <w:t>- There is a *lot* of stuff at the GitHub link. I wonder if it was all intended to be available to readers?</w:t>
+      </w:r>
+    </w:p>
+    <w:p>
+      <w:r>
+        <w:rPr>
+          <w:i/>
+          <w:iCs/>
+        </w:rPr>
+        <w:t xml:space="preserve">We have no secrets! Seriously, though, we will streamline what is included in the </w:t>
+      </w:r>
+      <w:proofErr w:type="spellStart"/>
+      <w:r>
+        <w:rPr>
+          <w:i/>
+          <w:iCs/>
+        </w:rPr>
+        <w:t>github</w:t>
+      </w:r>
+      <w:proofErr w:type="spellEnd"/>
+      <w:r>
+        <w:rPr>
+          <w:i/>
+          <w:iCs/>
+        </w:rPr>
+        <w:t xml:space="preserve"> link before publication. (We are impressed that you bothered to look!)</w:t>
+      </w:r>
+      <w:r>
+        <w:br/>
+      </w:r>
+      <w:r>
+        <w:br/>
+      </w:r>
+      <w:r>
+        <w:br/>
+        <w:t>Referee: 2</w:t>
+      </w:r>
+      <w:r>
+        <w:br/>
+      </w:r>
+      <w:r>
+        <w:br/>
+        <w:t>Comments to Author(s)</w:t>
+      </w:r>
+      <w:r>
+        <w:br/>
+      </w:r>
+      <w:r>
+        <w:br/>
+        <w:t xml:space="preserve">The manuscript be Cressler at </w:t>
+      </w:r>
+      <w:proofErr w:type="gramStart"/>
+      <w:r>
+        <w:t>al</w:t>
+      </w:r>
+      <w:proofErr w:type="gramEnd"/>
+      <w:r>
+        <w:t xml:space="preserve"> builds on classic epidemiological theory by challenging its two assumptions around </w:t>
+      </w:r>
+      <w:proofErr w:type="spellStart"/>
+      <w:r>
+        <w:t>probablity</w:t>
+      </w:r>
+      <w:proofErr w:type="spellEnd"/>
+      <w:r>
+        <w:t xml:space="preserve"> of recovery and recover rate. They put forward a new model which embraces immune heterogeneity. Whilst I do not have the expertise to comment in any depth on the modelling </w:t>
+      </w:r>
+      <w:proofErr w:type="gramStart"/>
+      <w:r>
+        <w:t>approach</w:t>
+      </w:r>
+      <w:proofErr w:type="gramEnd"/>
+      <w:r>
+        <w:t xml:space="preserve"> I do have some questions and comments which I hope will help with the clarity of their work.</w:t>
+      </w:r>
+      <w:r>
+        <w:br/>
+      </w:r>
+      <w:r>
+        <w:br/>
+      </w:r>
+      <w:r>
+        <w:lastRenderedPageBreak/>
+        <w:t xml:space="preserve">1. There are two things I would highlight in the Abstract to help the reader </w:t>
+      </w:r>
+      <w:proofErr w:type="gramStart"/>
+      <w:r>
+        <w:t>going</w:t>
+      </w:r>
+      <w:proofErr w:type="gramEnd"/>
+      <w:r>
+        <w:t xml:space="preserve"> forward:</w:t>
+      </w:r>
+      <w:r>
+        <w:br/>
+        <w:t xml:space="preserve">a). That the model is develop for multicellular parasites </w:t>
+      </w:r>
+      <w:proofErr w:type="spellStart"/>
+      <w:r>
+        <w:t>ie</w:t>
+      </w:r>
+      <w:proofErr w:type="spellEnd"/>
+      <w:r>
+        <w:t xml:space="preserve"> it is written in the context of parasites that do not multiply within their hosts</w:t>
+      </w:r>
+      <w:r>
+        <w:br/>
+        <w:t>b) Include an early definition of “recovery” (lines26-28; lines 52-53 in introduction). I believe the authors are using this in the context of worm cure/expulsion however from a host’s point of view this would also refer to the resolution of parasite -driven pathology after the parasite has been eliminated.</w:t>
+      </w:r>
+      <w:r>
+        <w:br/>
+      </w:r>
+      <w:r>
+        <w:br/>
+        <w:t xml:space="preserve">2. Line 209: It is unclear how the authors envisage antigen specificity fitting with their concept of “initial Th1 and Th2 numbers”. Are they suggesting that previous infections establish these initial T helper cell </w:t>
+      </w:r>
+      <w:proofErr w:type="spellStart"/>
+      <w:r>
+        <w:t>polarised</w:t>
+      </w:r>
+      <w:proofErr w:type="spellEnd"/>
+      <w:r>
+        <w:t xml:space="preserve"> states before (and so will not have antigen specificity for the incoming infection they are modelling), for example, helminth infection? Please clarify what “initial” refers to: a helminth-naïve host, or a reinfection model?</w:t>
+      </w:r>
+    </w:p>
+    <w:p>
+      <w:r>
+        <w:rPr>
+          <w:i/>
+          <w:iCs/>
+        </w:rPr>
+        <w:t>We are agnostic as to why hosts differ, so we don’t really consider antigen specificity. We agree that incorporating immune memory and subsequent greater resistance to future infection would be interesting, but this model is more concerned with immune phenotypes (Th1 and Th2) than with antigen specificity. Human immunology papers support that, regardless of memory, the immune state on the day of challenge is still highly predictive of subsequent infection dynamics. ADD SOMETHING TO MODEL EXTENSIONS PARAGRAPHS</w:t>
+      </w:r>
+      <w:r>
+        <w:br/>
+      </w:r>
+      <w:r>
+        <w:br/>
+        <w:t>Note – it is also possible to have interferon-type responses co-existing with mucosal Th2 responses (</w:t>
+      </w:r>
+      <w:proofErr w:type="spellStart"/>
+      <w:r>
+        <w:t>eg</w:t>
+      </w:r>
+      <w:proofErr w:type="spellEnd"/>
+      <w:r>
+        <w:t xml:space="preserve"> M. O. Burgess et al., Helminth induced monocytosis conveys protection from respiratory syncytial virus infection in mice. Allergy 79, 2157-2172 (2024)) so how does this fit with their idea that viral infections predispose to chronic low virulence parasite infections.  Should these nuances be acknowledged in the </w:t>
+      </w:r>
+      <w:proofErr w:type="gramStart"/>
+      <w:r>
+        <w:t>discussion?.</w:t>
+      </w:r>
+      <w:proofErr w:type="gramEnd"/>
+    </w:p>
+    <w:p>
+      <w:r>
+        <w:rPr>
+          <w:i/>
+          <w:iCs/>
+        </w:rPr>
+        <w:t xml:space="preserve">Nuances can be acknowledged. </w:t>
+      </w:r>
+      <w:r>
+        <w:rPr>
+          <w:i/>
+          <w:iCs/>
+        </w:rPr>
+        <w:t>ADD SOMETHING TO MODEL EXTENSIONS PARAGRAPHS</w:t>
+      </w:r>
+      <w:r>
+        <w:br/>
+      </w:r>
+      <w:r>
+        <w:br/>
+        <w:t xml:space="preserve">3. Lines 353- I struggled with the concept that acute infections </w:t>
+      </w:r>
+      <w:proofErr w:type="gramStart"/>
+      <w:r>
+        <w:t>leads</w:t>
+      </w:r>
+      <w:proofErr w:type="gramEnd"/>
+      <w:r>
+        <w:t xml:space="preserve"> to evolution of higher virulence increasing transmission rate as surely this would only apply to parasites with a particular </w:t>
+      </w:r>
+      <w:proofErr w:type="gramStart"/>
+      <w:r>
+        <w:t>life style</w:t>
+      </w:r>
+      <w:proofErr w:type="gramEnd"/>
+      <w:r>
+        <w:t xml:space="preserve"> strategy </w:t>
+      </w:r>
+      <w:proofErr w:type="spellStart"/>
+      <w:r>
+        <w:t>eg</w:t>
+      </w:r>
+      <w:proofErr w:type="spellEnd"/>
+      <w:r>
+        <w:t xml:space="preserve"> Trichinella which needs its host to die to enable transmission. For most parasitic helminths, acute infections mean the worm is expelled before the egg-laying adult stage and so would prevent transmission. Most parasites do not want to kill their host, so how can increasing virulence also increase transmission?</w:t>
+      </w:r>
+    </w:p>
+    <w:p>
+      <w:r>
+        <w:rPr>
+          <w:i/>
+          <w:iCs/>
+        </w:rPr>
+        <w:t>Address basic assumptions of virulence evolution literature for non-theory audience</w:t>
+      </w:r>
+      <w:r>
+        <w:br/>
+      </w:r>
+      <w:r>
+        <w:br/>
+        <w:t xml:space="preserve">4. The discussion tackles the importance of introducing T regulatory cells and the regulated </w:t>
+      </w:r>
+      <w:r>
+        <w:lastRenderedPageBreak/>
+        <w:t xml:space="preserve">immune state </w:t>
+      </w:r>
+      <w:proofErr w:type="gramStart"/>
+      <w:r>
+        <w:t>in to</w:t>
+      </w:r>
+      <w:proofErr w:type="gramEnd"/>
+      <w:r>
+        <w:t xml:space="preserve"> their model systems and I think this will be </w:t>
       </w:r>
       <w:proofErr w:type="gramStart"/>
       <w:r>
@@ -423,234 +1231,7 @@
       </w:r>
       <w:proofErr w:type="gramEnd"/>
       <w:r>
-        <w:t>, but I wonder if you need Tregs in the model to do this? Could the initial immune state of susceptible hosts be set to whatever it is when they recovered from a previous infection? I suppose you’d want that to decay over time and maybe Tregs could get you to whatever ‘baseline’ is faster? In any case, could you speculate about the extent to which results would vary if immunity was not (essentially) reset post-infection?</w:t>
-      </w:r>
-      <w:r>
-        <w:br/>
-      </w:r>
-      <w:r>
-        <w:br/>
-        <w:t>Minor things.</w:t>
-      </w:r>
-      <w:r>
-        <w:br/>
-        <w:t>- Figure 1A, is that a strip of red on the right end of the gray space or something funky going on with the plotting? If it’s the former, what’s up with that?! How does that happen?</w:t>
-      </w:r>
-      <w:r>
-        <w:br/>
-      </w:r>
-      <w:r>
-        <w:br/>
-        <w:t xml:space="preserve">- </w:t>
-      </w:r>
-      <w:proofErr w:type="spellStart"/>
-      <w:r>
-        <w:t>Eqn</w:t>
-      </w:r>
-      <w:proofErr w:type="spellEnd"/>
-      <w:r>
-        <w:t xml:space="preserve"> 1, the self-activation term for the T1 response, the numerator has S_1^p. Should that p be 2? I see that in the 2024 paper, p=2 was the default choice (and that it’s 2 in the T_2 equation), but I don’t see p defined in Table 1.</w:t>
-      </w:r>
-      <w:r>
-        <w:br/>
-      </w:r>
-      <w:r>
-        <w:br/>
-        <w:t>- It’s a bit unfortunate that I is both infected in the epi model and inhibition in the within-host model. Could change inhibition to something else — N? H?  </w:t>
-      </w:r>
-      <w:r>
-        <w:br/>
-      </w:r>
-      <w:r>
-        <w:br/>
-        <w:t>- l. 235, “black” should say “blue”, presumably?</w:t>
-      </w:r>
-      <w:r>
-        <w:br/>
-      </w:r>
-      <w:r>
-        <w:br/>
-        <w:t>- l. 277,  says “first 500 time steps”, but the plots look like stop at 450?</w:t>
-      </w:r>
-      <w:r>
-        <w:br/>
-      </w:r>
-      <w:r>
-        <w:br/>
-        <w:t>- l. 356, I’m not sure I know what a “nutritional plane” is.</w:t>
-      </w:r>
-      <w:r>
-        <w:br/>
-      </w:r>
-      <w:r>
-        <w:br/>
-        <w:t>- l. 363, should these references should be to Figures 5A and 5B?</w:t>
-      </w:r>
-      <w:r>
-        <w:br/>
-      </w:r>
-      <w:r>
-        <w:br/>
-        <w:t>- I know this may not be standard, but I use “parasite” and “pathogen” interchangeably, so l.476-478 reads funny to me (without more specificity in which “pathogens” we are talking about).</w:t>
-      </w:r>
-      <w:r>
-        <w:br/>
-      </w:r>
-      <w:r>
-        <w:br/>
-        <w:t>- There is a *lot* of stuff at the GitHub link. I wonder if it was all intended to be available to readers?</w:t>
-      </w:r>
-      <w:r>
-        <w:br/>
-      </w:r>
-      <w:r>
-        <w:br/>
-      </w:r>
-      <w:r>
-        <w:br/>
-        <w:t>Referee: 2</w:t>
-      </w:r>
-      <w:r>
-        <w:br/>
-      </w:r>
-      <w:r>
-        <w:br/>
-        <w:t>Comments to Author(s)</w:t>
-      </w:r>
-      <w:r>
-        <w:br/>
-      </w:r>
-      <w:r>
-        <w:lastRenderedPageBreak/>
-        <w:br/>
-        <w:t xml:space="preserve">The manuscript be </w:t>
-      </w:r>
-      <w:proofErr w:type="spellStart"/>
-      <w:r>
-        <w:t>Cressler</w:t>
-      </w:r>
-      <w:proofErr w:type="spellEnd"/>
-      <w:r>
-        <w:t xml:space="preserve"> at al builds on classic epidemiological theory by challenging its two assumptions around </w:t>
-      </w:r>
-      <w:proofErr w:type="spellStart"/>
-      <w:r>
-        <w:t>probablity</w:t>
-      </w:r>
-      <w:proofErr w:type="spellEnd"/>
-      <w:r>
-        <w:t xml:space="preserve"> of recovery and recover rate. They put forward a new model which embraces immune heterogeneity. Whilst I do not have the expertise to comment in any depth on the modelling </w:t>
-      </w:r>
-      <w:proofErr w:type="gramStart"/>
-      <w:r>
-        <w:t>approach</w:t>
-      </w:r>
-      <w:proofErr w:type="gramEnd"/>
-      <w:r>
-        <w:t xml:space="preserve"> I do have some questions and comments which I hope will help with the clarity of their work.</w:t>
-      </w:r>
-      <w:r>
-        <w:br/>
-      </w:r>
-      <w:r>
-        <w:br/>
-        <w:t>1. There are two things I would highlight in the Abstract to help the reader going forward:</w:t>
-      </w:r>
-      <w:r>
-        <w:br/>
-        <w:t xml:space="preserve">a). That the model is develop for multicellular parasites </w:t>
-      </w:r>
-      <w:proofErr w:type="spellStart"/>
-      <w:r>
-        <w:t>ie</w:t>
-      </w:r>
-      <w:proofErr w:type="spellEnd"/>
-      <w:r>
-        <w:t xml:space="preserve"> it is written in the context of parasites that do not multiply within their hosts</w:t>
-      </w:r>
-      <w:r>
-        <w:br/>
-        <w:t>b) Include an early definition of “recovery” (lines26-28; lines 52-53 in introduction). I believe the authors are using this in the context of worm cure/expulsion however from a host’s point of view this would also refer to the resolution of parasite -driven pathology after the parasite has been eliminated.</w:t>
-      </w:r>
-      <w:r>
-        <w:br/>
-      </w:r>
-      <w:r>
-        <w:br/>
-        <w:t xml:space="preserve">2. Line 209: It is unclear how the authors envisage antigen specificity fitting with their concept of “initial Th1 and Th2 numbers”. Are they suggesting that previous infections establish </w:t>
-      </w:r>
-      <w:proofErr w:type="gramStart"/>
-      <w:r>
-        <w:t>these initial T helper</w:t>
-      </w:r>
-      <w:proofErr w:type="gramEnd"/>
-      <w:r>
-        <w:t xml:space="preserve"> cell </w:t>
-      </w:r>
-      <w:proofErr w:type="spellStart"/>
-      <w:r>
-        <w:t>polarised</w:t>
-      </w:r>
-      <w:proofErr w:type="spellEnd"/>
-      <w:r>
-        <w:t xml:space="preserve"> states before (and so will not have antigen specificity for the incoming infection they are modelling), for example, helminth infection? Please clarify what “initial” refers to: a helminth-naïve host, or a reinfection model?</w:t>
-      </w:r>
-      <w:r>
-        <w:br/>
-      </w:r>
-      <w:r>
-        <w:br/>
-        <w:t>Note – it is also possible to have interferon-type responses co-existing with mucosal Th2 responses (</w:t>
-      </w:r>
-      <w:proofErr w:type="spellStart"/>
-      <w:r>
-        <w:t>eg</w:t>
-      </w:r>
-      <w:proofErr w:type="spellEnd"/>
-      <w:r>
-        <w:t xml:space="preserve"> M. O. Burgess et al., Helminth induced monocytosis conveys protection from respiratory syncytial virus infection in mice. Allergy 79, 2157-2172 (2024)) so how does this fit with their idea that viral infections predispose to chronic low virulence parasite infections.  Should these nuances be acknowledged in the discussion?.</w:t>
-      </w:r>
-      <w:r>
-        <w:br/>
-      </w:r>
-      <w:r>
-        <w:br/>
-        <w:t xml:space="preserve">3. Lines 353- I struggled with the concept that acute infections </w:t>
-      </w:r>
-      <w:proofErr w:type="gramStart"/>
-      <w:r>
-        <w:t>leads</w:t>
-      </w:r>
-      <w:proofErr w:type="gramEnd"/>
-      <w:r>
-        <w:t xml:space="preserve"> to evolution of higher virulence increasing transmission rate as surely this would only apply to parasites with a particular life style strategy </w:t>
-      </w:r>
-      <w:proofErr w:type="spellStart"/>
-      <w:r>
-        <w:t>eg</w:t>
-      </w:r>
-      <w:proofErr w:type="spellEnd"/>
-      <w:r>
-        <w:t xml:space="preserve"> Trichinella which needs its host to die to enable transmission. For most parasitic helminths, acute infections mean the worm is expelled before the egg-laying adult stage and so would prevent transmission. Most parasites do not want to kill their host, so how can increasing virulence also increase transmission?</w:t>
-      </w:r>
-      <w:r>
-        <w:br/>
-      </w:r>
-      <w:r>
-        <w:br/>
-        <w:t xml:space="preserve">4. The discussion tackles the importance of introducing T regulatory cells and the regulated immune state </w:t>
-      </w:r>
-      <w:proofErr w:type="gramStart"/>
-      <w:r>
-        <w:t>in to</w:t>
-      </w:r>
-      <w:proofErr w:type="gramEnd"/>
-      <w:r>
-        <w:t xml:space="preserve"> their model systems and I think this will be really interesting to see how the model then plays out.  I did wonder whether there was space within the discussion to be more visionary in terms of how the improved modelling approaches could be deployed </w:t>
-      </w:r>
-      <w:r>
-        <w:lastRenderedPageBreak/>
-        <w:t xml:space="preserve">to achieve impact in the context of predicting how parasites will evolve </w:t>
+        <w:t xml:space="preserve"> to see how the model then plays out.  I did wonder whether there was space within the discussion to be more visionary in terms of how the improved modelling approaches could be deployed to achieve impact in the context of predicting how parasites will evolve </w:t>
       </w:r>
       <w:proofErr w:type="spellStart"/>
       <w:r>
@@ -698,7 +1279,7 @@
 </file>
 
 <file path=word/styles.xml><?xml version="1.0" encoding="utf-8"?>
-<w:styles xmlns:mc="http://schemas.openxmlformats.org/markup-compatibility/2006" xmlns:r="http://schemas.openxmlformats.org/officeDocument/2006/relationships" xmlns:w="http://schemas.openxmlformats.org/wordprocessingml/2006/main" xmlns:w14="http://schemas.microsoft.com/office/word/2010/wordml" xmlns:w15="http://schemas.microsoft.com/office/word/2012/wordml" xmlns:w16cex="http://schemas.microsoft.com/office/word/2018/wordml/cex" xmlns:w16cid="http://schemas.microsoft.com/office/word/2016/wordml/cid" xmlns:w16="http://schemas.microsoft.com/office/word/2018/wordml" xmlns:w16du="http://schemas.microsoft.com/office/word/2023/wordml/word16du" xmlns:w16sdtdh="http://schemas.microsoft.com/office/word/2020/wordml/sdtdatahash" xmlns:w16se="http://schemas.microsoft.com/office/word/2015/wordml/symex" mc:Ignorable="w14 w15 w16se w16cid w16 w16cex w16sdtdh w16du">
+<w:styles xmlns:mc="http://schemas.openxmlformats.org/markup-compatibility/2006" xmlns:r="http://schemas.openxmlformats.org/officeDocument/2006/relationships" xmlns:w="http://schemas.openxmlformats.org/wordprocessingml/2006/main" xmlns:w14="http://schemas.microsoft.com/office/word/2010/wordml" xmlns:w15="http://schemas.microsoft.com/office/word/2012/wordml" xmlns:w16cex="http://schemas.microsoft.com/office/word/2018/wordml/cex" xmlns:w16cid="http://schemas.microsoft.com/office/word/2016/wordml/cid" xmlns:w16="http://schemas.microsoft.com/office/word/2018/wordml" xmlns:w16du="http://schemas.microsoft.com/office/word/2023/wordml/word16du" xmlns:w16sdtdh="http://schemas.microsoft.com/office/word/2020/wordml/sdtdatahash" xmlns:w16sdtfl="http://schemas.microsoft.com/office/word/2024/wordml/sdtformatlock" xmlns:w16se="http://schemas.microsoft.com/office/word/2015/wordml/symex" mc:Ignorable="w14 w15 w16se w16cid w16 w16cex w16sdtdh w16sdtfl w16du">
   <w:docDefaults>
     <w:rPrDefault>
       <w:rPr>

</xml_diff>